<commit_message>
Transfer learning: fleet-pretrained checkpoint + frozen-body head fine-tune
- p3evhm.models: save/load_pretrained, finetune(freeze_body) with trainable-param count
- pretrained ckpt ships in package (279 pooled cycles, 3 cells, 21 KB)
- measured on held-out B0007: head fine-tune MAE 0.0575 vs 0.2346 scratch (4.1x),
  RUL err 6 vs no-crossing, 0.056s vs 3.53s (63x); V=0.000
- app.py: default transfer mode, zero-shot vs fine-tuned comparison, state-leak fix
  (deepcopy before finetune - cache_resource mutation bug caught by AppTest)
- paper Sec V-E + abstract; verify 92/92; AppTest ALL_PASS x2
</commit_message>
<xml_diff>
--- a/P3-EVHM_paper.docx
+++ b/P3-EVHM_paper.docx
@@ -93,7 +93,7 @@
           <w:i w:val="0"/>
           <w:sz w:val="18"/>
         </w:rPr>
-        <w:t>Abstract-Electric vehicles (EVs) are becoming increasingly important for sustainable transportation, making reliable battery health monitoring essential for safety, performance, and long-term operation. Lithium-ion batteries gradually lose their capacity and efficiency due to repeated charging and discharging, temperature variations, and ageing. Therefore, accurately estimating the State of Health (SoH) and Remaining Useful Life (RUL) of a battery is necessary for predicting degradation and supporting timely maintenance. This paper proposes P3-EVHM, a framework that combines physics-informed Long Short-Term Memory (LSTM) networks with particle filtering to improve battery health estimation and prediction under uncertainty. Physics-informed constraints are used to keep predictions consistent with expected battery behaviour, while particle filtering estimates full RUL distributions rather than point predictions. GPU acceleration parallelizes the particle operations; on an NVIDIA Tesla T4, end-to-end speedups of up to 16.5x were measured at 500,000 particles, with parity below 5,000 particles, consistent with the documented small-workload failure mode. The framework is evaluated on the NASA Ames Prognostics Center of Excellence battery dataset across 4 cells, 5 prediction start points, and 6 baselines on two compute environments, using prediction-error metrics, prediction-interval coverage, physics-constraint violation rates, and CPU/GPU timing. A systematic survey of the literature shows that existing work covers physics-informed LSTMs without filtering, particle filters without deep learning, and LSTM-filter fusions without physics constraints, while GPU-accelerated battery prognostics has not been revisited since pre-deep-learning work; no published framework integrates all four pillars. P3-EVHM is therefore positioned as an integration-and-systems contribution. All reported results are measured on the NASA PCoE dataset under the stated protocol on both compute environments.</w:t>
+        <w:t>Abstract-Electric vehicles (EVs) are becoming increasingly important for sustainable transportation, making reliable battery health monitoring essential for safety, performance, and long-term operation. Lithium-ion batteries gradually lose their capacity and efficiency due to repeated charging and discharging, temperature variations, and ageing. Therefore, accurately estimating the State of Health (SoH) and Remaining Useful Life (RUL) of a battery is necessary for predicting degradation and supporting timely maintenance. This paper proposes P3-EVHM, a framework that combines physics-informed Long Short-Term Memory (LSTM) networks with particle filtering to improve battery health estimation and prediction under uncertainty. Physics-informed constraints are used to keep predictions consistent with expected battery behaviour, while particle filtering estimates full RUL distributions rather than point predictions. A pretrained transfer mode ships a fleet-trained checkpoint and adapts a new cell by freezing the LSTM body and fine-tuning only the output head, which on a held-out cell measured 4.1x lower capacity error than from-scratch training at 63x less adaptation time. GPU acceleration parallelizes the particle operations; on an NVIDIA Tesla T4, end-to-end speedups of up to 16.5x were measured at 500,000 particles, with parity below 5,000 particles, consistent with the documented small-workload failure mode. The framework is evaluated on the NASA Ames Prognostics Center of Excellence battery dataset across 4 cells, 5 prediction start points, and 6 baselines on two compute environments, using prediction-error metrics, prediction-interval coverage, physics-constraint violation rates, and CPU/GPU timing. A systematic survey of the literature shows that existing work covers physics-informed LSTMs without filtering, particle filters without deep learning, and LSTM-filter fusions without physics constraints, while GPU-accelerated battery prognostics has not been revisited since pre-deep-learning work; no published framework integrates all four pillars. P3-EVHM is therefore positioned as an integration-and-systems contribution. All reported results are measured on the NASA PCoE dataset under the stated protocol on both compute environments.</w:t>
       </w:r>
     </w:p>
     <w:p>
@@ -749,6 +749,34 @@
           <w:sz w:val="20"/>
         </w:rPr>
         <w:t>V is reported for every model variant, making the effect of L_mono directly measurable. Interval calibration is assessed by empirical coverage of the 95% RUL interval and its width.</w:t>
+      </w:r>
+    </w:p>
+    <w:p>
+      <w:pPr>
+        <w:spacing w:before="120" w:after="60"/>
+        <w:jc w:val="left"/>
+      </w:pPr>
+      <w:r>
+        <w:rPr>
+          <w:b/>
+          <w:i/>
+          <w:sz w:val="20"/>
+        </w:rPr>
+        <w:t>E. Pretrained transfer mode</w:t>
+      </w:r>
+    </w:p>
+    <w:p>
+      <w:pPr>
+        <w:spacing w:after="80"/>
+        <w:jc w:val="both"/>
+      </w:pPr>
+      <w:r>
+        <w:rPr>
+          <w:b w:val="0"/>
+          <w:i w:val="0"/>
+          <w:sz w:val="20"/>
+        </w:rPr>
+        <w:t>To remove the from-scratch training requirement for new deployments, the framework ships a fleet-pretrained checkpoint: a hidden-32 PI-LSTM trained with the full Eq. (3) loss on 279 pooled cycles from B0005, B0006 and B0018 (first 60% of each cell), with B0007 fully held out. Adaptation to a new cell freezes every LSTM body layer (requires_grad = False) and retrains only the output head for 30 epochs on the new cell's early cycles - the fleet-learned temporal features are protected from catastrophic forgetting while the head absorbs the cell-specific scale. Measured on the held-out cell B0007 (80% EOL = 1.60 Ah, prediction start cycle 52, true RUL 34 cycles): from-scratch training (200 epochs) reached capacity MAE 0.2346 Ah with V = 0.017, produced no threshold crossing, in 3.53 s; the pretrained zero-shot model reached MAE 0.5592 Ah with V = 0.000 and RUL error 32 cycles at 0 s adaptation; the frozen-body head fine-tune reached MAE 0.0575 Ah (4.1x lower than from-scratch), V = 0.000, RUL error 6 cycles, in 0.056 s - 63x faster than from-scratch. Full fine-tuning (body unfrozen, 30 epochs) matched head-only (MAE 0.0575 Ah, 0.058 s), indicating that the learned body layers transfer and the head carries the cell-specific scale. The PF decline prior derived from the fine-tuned forecast remains shallow on this path (PF RUL error 37 cycles vs 10 for zero-shot), so the decline-prior floor identified in Section X applies here as well.</w:t>
       </w:r>
     </w:p>
     <w:p>

</xml_diff>

<commit_message>
Transfer validation: LOOCV protocol (16 adaptations), all invariants PASS
- tests/test_transfer.py: leave-one-cell-out for all 4 cells with invariant checks
  (body bit-identical under frozen FT, head-only trainable=33, full-FT changes body,
  determinism, no state leak, transfer RUL 12/12 with zero violations)
- caught + fixed real bug: finetune froze net[1] (passthrough) not net[0] (LSTM body)
- honest result replaces single-cell overclaim: transfer buys RUL availability
  (4/4 vs scratch 1/4) + zero violations at ~14x less adaptation time;
  scratch wins raw MAE on 3/4 but produces no RUL there (V up to 0.355)
- paper Sec V-E rewritten + Table V; abstract updated; verify 93/93
</commit_message>
<xml_diff>
--- a/P3-EVHM_paper.docx
+++ b/P3-EVHM_paper.docx
@@ -93,7 +93,7 @@
           <w:i w:val="0"/>
           <w:sz w:val="18"/>
         </w:rPr>
-        <w:t>Abstract-Electric vehicles (EVs) are becoming increasingly important for sustainable transportation, making reliable battery health monitoring essential for safety, performance, and long-term operation. Lithium-ion batteries gradually lose their capacity and efficiency due to repeated charging and discharging, temperature variations, and ageing. Therefore, accurately estimating the State of Health (SoH) and Remaining Useful Life (RUL) of a battery is necessary for predicting degradation and supporting timely maintenance. This paper proposes P3-EVHM, a framework that combines physics-informed Long Short-Term Memory (LSTM) networks with particle filtering to improve battery health estimation and prediction under uncertainty. Physics-informed constraints are used to keep predictions consistent with expected battery behaviour, while particle filtering estimates full RUL distributions rather than point predictions. A pretrained transfer mode ships a fleet-trained checkpoint and adapts a new cell by freezing the LSTM body and fine-tuning only the output head, which on a held-out cell measured 4.1x lower capacity error than from-scratch training at 63x less adaptation time. GPU acceleration parallelizes the particle operations; on an NVIDIA Tesla T4, end-to-end speedups of up to 16.5x were measured at 500,000 particles, with parity below 5,000 particles, consistent with the documented small-workload failure mode. The framework is evaluated on the NASA Ames Prognostics Center of Excellence battery dataset across 4 cells, 5 prediction start points, and 6 baselines on two compute environments, using prediction-error metrics, prediction-interval coverage, physics-constraint violation rates, and CPU/GPU timing. A systematic survey of the literature shows that existing work covers physics-informed LSTMs without filtering, particle filters without deep learning, and LSTM-filter fusions without physics constraints, while GPU-accelerated battery prognostics has not been revisited since pre-deep-learning work; no published framework integrates all four pillars. P3-EVHM is therefore positioned as an integration-and-systems contribution. All reported results are measured on the NASA PCoE dataset under the stated protocol on both compute environments.</w:t>
+        <w:t>Abstract-Electric vehicles (EVs) are becoming increasingly important for sustainable transportation, making reliable battery health monitoring essential for safety, performance, and long-term operation. Lithium-ion batteries gradually lose their capacity and efficiency due to repeated charging and discharging, temperature variations, and ageing. Therefore, accurately estimating the State of Health (SoH) and Remaining Useful Life (RUL) of a battery is necessary for predicting degradation and supporting timely maintenance. This paper proposes P3-EVHM, a framework that combines physics-informed Long Short-Term Memory (LSTM) networks with particle filtering to improve battery health estimation and prediction under uncertainty. Physics-informed constraints are used to keep predictions consistent with expected battery behaviour, while particle filtering estimates full RUL distributions rather than point predictions. A pretrained transfer mode ships a fleet-trained checkpoint and adapts a new cell by freezing the LSTM body and fine-tuning only the output head; in leave-one-cell-out validation every transfer mode produced RUL estimates in all held-out cells with zero physics violations, where from-scratch training produced them in one of four cells, at roughly an order of magnitude less adaptation time. GPU acceleration parallelizes the particle operations; on an NVIDIA Tesla T4, end-to-end speedups of up to 16.5x were measured at 500,000 particles, with parity below 5,000 particles, consistent with the documented small-workload failure mode. The framework is evaluated on the NASA Ames Prognostics Center of Excellence battery dataset across 4 cells, 5 prediction start points, and 6 baselines on two compute environments, using prediction-error metrics, prediction-interval coverage, physics-constraint violation rates, and CPU/GPU timing. A systematic survey of the literature shows that existing work covers physics-informed LSTMs without filtering, particle filters without deep learning, and LSTM-filter fusions without physics constraints, while GPU-accelerated battery prognostics has not been revisited since pre-deep-learning work; no published framework integrates all four pillars. P3-EVHM is therefore positioned as an integration-and-systems contribution. All reported results are measured on the NASA PCoE dataset under the stated protocol on both compute environments.</w:t>
       </w:r>
     </w:p>
     <w:p>
@@ -776,7 +776,433 @@
           <w:i w:val="0"/>
           <w:sz w:val="20"/>
         </w:rPr>
-        <w:t>To remove the from-scratch training requirement for new deployments, the framework ships a fleet-pretrained checkpoint: a hidden-32 PI-LSTM trained with the full Eq. (3) loss on 279 pooled cycles from B0005, B0006 and B0018 (first 60% of each cell), with B0007 fully held out. Adaptation to a new cell freezes every LSTM body layer (requires_grad = False) and retrains only the output head for 30 epochs on the new cell's early cycles - the fleet-learned temporal features are protected from catastrophic forgetting while the head absorbs the cell-specific scale. Measured on the held-out cell B0007 (80% EOL = 1.60 Ah, prediction start cycle 52, true RUL 34 cycles): from-scratch training (200 epochs) reached capacity MAE 0.2346 Ah with V = 0.017, produced no threshold crossing, in 3.53 s; the pretrained zero-shot model reached MAE 0.5592 Ah with V = 0.000 and RUL error 32 cycles at 0 s adaptation; the frozen-body head fine-tune reached MAE 0.0575 Ah (4.1x lower than from-scratch), V = 0.000, RUL error 6 cycles, in 0.056 s - 63x faster than from-scratch. Full fine-tuning (body unfrozen, 30 epochs) matched head-only (MAE 0.0575 Ah, 0.058 s), indicating that the learned body layers transfer and the head carries the cell-specific scale. The PF decline prior derived from the fine-tuned forecast remains shallow on this path (PF RUL error 37 cycles vs 10 for zero-shot), so the decline-prior floor identified in Section X applies here as well.</w:t>
+        <w:t>To remove the from-scratch training requirement, the framework ships a fleet-pretrained checkpoint: a hidden-32 PI-LSTM trained with the full Eq. (3) loss on 279 pooled cycles from the first-60% segments of three cells, with the evaluated cell fully held out. Adaptation either freezes every LSTM body layer and retrains only the output head (30 epochs), or briefly fine-tunes all layers (30 epochs, lr 1e-3). A leave-one-cell-out protocol (each cell held out in turn, prediction start at 60% of life, 16 adaptations in total) measured the following: every transfer mode produced a RUL estimate in all 12 transfer runs with zero physics violations (V = 0.000), whereas from-scratch training (200 epochs) produced a RUL estimate in only 1 of 4 held-out cells and violated monotonicity up to V = 0.355. Mean capacity MAE of the frozen-body head fine-tune (0.221 Ah) is comparable to from-scratch (0.210 Ah) at roughly an order of magnitude less adaptation time (0.10-0.47 s vs 1.65-5.64 s per cell). Table V summarises the protocol; the best transfer mode varies by cell (head-only is best on B0005, full fine-tune on B0007 with MAE 0.0575 Ah and RUL error 6 cycles), so per-cell mode selection is future work, as is the decline-prior floor for the PF on this path (Section X). Transfer therefore buys RUL availability and physical consistency - the properties a maintenance decision needs - rather than raw capacity MAE.</w:t>
+      </w:r>
+    </w:p>
+    <w:p>
+      <w:pPr>
+        <w:spacing w:after="40"/>
+        <w:jc w:val="center"/>
+      </w:pPr>
+      <w:r>
+        <w:rPr>
+          <w:b w:val="0"/>
+          <w:i w:val="0"/>
+          <w:sz w:val="18"/>
+        </w:rPr>
+        <w:t>TABLE V. Leave-one-cell-out transfer validation (each cell held out in turn; mean over 4 cells, all values measured)</w:t>
+      </w:r>
+    </w:p>
+    <w:tbl>
+      <w:tblPr>
+        <w:tblStyle w:val="TableGrid"/>
+        <w:tblW w:type="auto" w:w="0"/>
+        <w:tblLook w:firstColumn="1" w:firstRow="1" w:lastColumn="0" w:lastRow="0" w:noHBand="0" w:noVBand="1" w:val="04A0"/>
+      </w:tblPr>
+      <w:tblGrid>
+        <w:gridCol w:w="2016"/>
+        <w:gridCol w:w="2016"/>
+        <w:gridCol w:w="2016"/>
+        <w:gridCol w:w="2016"/>
+        <w:gridCol w:w="2016"/>
+      </w:tblGrid>
+      <w:tr>
+        <w:tc>
+          <w:tcPr>
+            <w:tcW w:type="dxa" w:w="2016"/>
+          </w:tcPr>
+          <w:p>
+            <w:r/>
+            <w:r>
+              <w:rPr>
+                <w:b/>
+                <w:sz w:val="17"/>
+              </w:rPr>
+              <w:t>Mode</w:t>
+            </w:r>
+          </w:p>
+        </w:tc>
+        <w:tc>
+          <w:tcPr>
+            <w:tcW w:type="dxa" w:w="2016"/>
+          </w:tcPr>
+          <w:p>
+            <w:r/>
+            <w:r>
+              <w:rPr>
+                <w:b/>
+                <w:sz w:val="17"/>
+              </w:rPr>
+              <w:t>Mean MAE (Ah)</w:t>
+            </w:r>
+          </w:p>
+        </w:tc>
+        <w:tc>
+          <w:tcPr>
+            <w:tcW w:type="dxa" w:w="2016"/>
+          </w:tcPr>
+          <w:p>
+            <w:r/>
+            <w:r>
+              <w:rPr>
+                <w:b/>
+                <w:sz w:val="17"/>
+              </w:rPr>
+              <w:t>RUL availability</w:t>
+            </w:r>
+          </w:p>
+        </w:tc>
+        <w:tc>
+          <w:tcPr>
+            <w:tcW w:type="dxa" w:w="2016"/>
+          </w:tcPr>
+          <w:p>
+            <w:r/>
+            <w:r>
+              <w:rPr>
+                <w:b/>
+                <w:sz w:val="17"/>
+              </w:rPr>
+              <w:t>V (max)</w:t>
+            </w:r>
+          </w:p>
+        </w:tc>
+        <w:tc>
+          <w:tcPr>
+            <w:tcW w:type="dxa" w:w="2016"/>
+          </w:tcPr>
+          <w:p>
+            <w:r/>
+            <w:r>
+              <w:rPr>
+                <w:b/>
+                <w:sz w:val="17"/>
+              </w:rPr>
+              <w:t>Mean adapt time (s)</w:t>
+            </w:r>
+          </w:p>
+        </w:tc>
+      </w:tr>
+      <w:tr>
+        <w:tc>
+          <w:tcPr>
+            <w:tcW w:type="dxa" w:w="2016"/>
+          </w:tcPr>
+          <w:p>
+            <w:r/>
+            <w:r>
+              <w:rPr>
+                <w:b w:val="0"/>
+                <w:sz w:val="17"/>
+              </w:rPr>
+              <w:t>From scratch (200 epochs)</w:t>
+            </w:r>
+          </w:p>
+        </w:tc>
+        <w:tc>
+          <w:tcPr>
+            <w:tcW w:type="dxa" w:w="2016"/>
+          </w:tcPr>
+          <w:p>
+            <w:r/>
+            <w:r>
+              <w:rPr>
+                <w:b w:val="0"/>
+                <w:sz w:val="17"/>
+              </w:rPr>
+              <w:t>0.210</w:t>
+            </w:r>
+          </w:p>
+        </w:tc>
+        <w:tc>
+          <w:tcPr>
+            <w:tcW w:type="dxa" w:w="2016"/>
+          </w:tcPr>
+          <w:p>
+            <w:r/>
+            <w:r>
+              <w:rPr>
+                <w:b w:val="0"/>
+                <w:sz w:val="17"/>
+              </w:rPr>
+              <w:t>1 of 4</w:t>
+            </w:r>
+          </w:p>
+        </w:tc>
+        <w:tc>
+          <w:tcPr>
+            <w:tcW w:type="dxa" w:w="2016"/>
+          </w:tcPr>
+          <w:p>
+            <w:r/>
+            <w:r>
+              <w:rPr>
+                <w:b w:val="0"/>
+                <w:sz w:val="17"/>
+              </w:rPr>
+              <w:t>0.355</w:t>
+            </w:r>
+          </w:p>
+        </w:tc>
+        <w:tc>
+          <w:tcPr>
+            <w:tcW w:type="dxa" w:w="2016"/>
+          </w:tcPr>
+          <w:p>
+            <w:r/>
+            <w:r>
+              <w:rPr>
+                <w:b w:val="0"/>
+                <w:sz w:val="17"/>
+              </w:rPr>
+              <w:t>2.85</w:t>
+            </w:r>
+          </w:p>
+        </w:tc>
+      </w:tr>
+      <w:tr>
+        <w:tc>
+          <w:tcPr>
+            <w:tcW w:type="dxa" w:w="2016"/>
+          </w:tcPr>
+          <w:p>
+            <w:r/>
+            <w:r>
+              <w:rPr>
+                <w:b w:val="0"/>
+                <w:sz w:val="17"/>
+              </w:rPr>
+              <w:t>Pretrained zero-shot</w:t>
+            </w:r>
+          </w:p>
+        </w:tc>
+        <w:tc>
+          <w:tcPr>
+            <w:tcW w:type="dxa" w:w="2016"/>
+          </w:tcPr>
+          <w:p>
+            <w:r/>
+            <w:r>
+              <w:rPr>
+                <w:b w:val="0"/>
+                <w:sz w:val="17"/>
+              </w:rPr>
+              <w:t>0.335</w:t>
+            </w:r>
+          </w:p>
+        </w:tc>
+        <w:tc>
+          <w:tcPr>
+            <w:tcW w:type="dxa" w:w="2016"/>
+          </w:tcPr>
+          <w:p>
+            <w:r/>
+            <w:r>
+              <w:rPr>
+                <w:b w:val="0"/>
+                <w:sz w:val="17"/>
+              </w:rPr>
+              <w:t>4 of 4</w:t>
+            </w:r>
+          </w:p>
+        </w:tc>
+        <w:tc>
+          <w:tcPr>
+            <w:tcW w:type="dxa" w:w="2016"/>
+          </w:tcPr>
+          <w:p>
+            <w:r/>
+            <w:r>
+              <w:rPr>
+                <w:b w:val="0"/>
+                <w:sz w:val="17"/>
+              </w:rPr>
+              <w:t>0.000</w:t>
+            </w:r>
+          </w:p>
+        </w:tc>
+        <w:tc>
+          <w:tcPr>
+            <w:tcW w:type="dxa" w:w="2016"/>
+          </w:tcPr>
+          <w:p>
+            <w:r/>
+            <w:r>
+              <w:rPr>
+                <w:b w:val="0"/>
+                <w:sz w:val="17"/>
+              </w:rPr>
+              <w:t>0</w:t>
+            </w:r>
+          </w:p>
+        </w:tc>
+      </w:tr>
+      <w:tr>
+        <w:tc>
+          <w:tcPr>
+            <w:tcW w:type="dxa" w:w="2016"/>
+          </w:tcPr>
+          <w:p>
+            <w:r/>
+            <w:r>
+              <w:rPr>
+                <w:b w:val="0"/>
+                <w:sz w:val="17"/>
+              </w:rPr>
+              <w:t>Head fine-tune (frozen body)</w:t>
+            </w:r>
+          </w:p>
+        </w:tc>
+        <w:tc>
+          <w:tcPr>
+            <w:tcW w:type="dxa" w:w="2016"/>
+          </w:tcPr>
+          <w:p>
+            <w:r/>
+            <w:r>
+              <w:rPr>
+                <w:b w:val="0"/>
+                <w:sz w:val="17"/>
+              </w:rPr>
+              <w:t>0.221</w:t>
+            </w:r>
+          </w:p>
+        </w:tc>
+        <w:tc>
+          <w:tcPr>
+            <w:tcW w:type="dxa" w:w="2016"/>
+          </w:tcPr>
+          <w:p>
+            <w:r/>
+            <w:r>
+              <w:rPr>
+                <w:b w:val="0"/>
+                <w:sz w:val="17"/>
+              </w:rPr>
+              <w:t>4 of 4</w:t>
+            </w:r>
+          </w:p>
+        </w:tc>
+        <w:tc>
+          <w:tcPr>
+            <w:tcW w:type="dxa" w:w="2016"/>
+          </w:tcPr>
+          <w:p>
+            <w:r/>
+            <w:r>
+              <w:rPr>
+                <w:b w:val="0"/>
+                <w:sz w:val="17"/>
+              </w:rPr>
+              <w:t>0.000</w:t>
+            </w:r>
+          </w:p>
+        </w:tc>
+        <w:tc>
+          <w:tcPr>
+            <w:tcW w:type="dxa" w:w="2016"/>
+          </w:tcPr>
+          <w:p>
+            <w:r/>
+            <w:r>
+              <w:rPr>
+                <w:b w:val="0"/>
+                <w:sz w:val="17"/>
+              </w:rPr>
+              <w:t>0.20</w:t>
+            </w:r>
+          </w:p>
+        </w:tc>
+      </w:tr>
+      <w:tr>
+        <w:tc>
+          <w:tcPr>
+            <w:tcW w:type="dxa" w:w="2016"/>
+          </w:tcPr>
+          <w:p>
+            <w:r/>
+            <w:r>
+              <w:rPr>
+                <w:b w:val="0"/>
+                <w:sz w:val="17"/>
+              </w:rPr>
+              <w:t>Full fine-tune (30 epochs)</w:t>
+            </w:r>
+          </w:p>
+        </w:tc>
+        <w:tc>
+          <w:tcPr>
+            <w:tcW w:type="dxa" w:w="2016"/>
+          </w:tcPr>
+          <w:p>
+            <w:r/>
+            <w:r>
+              <w:rPr>
+                <w:b w:val="0"/>
+                <w:sz w:val="17"/>
+              </w:rPr>
+              <w:t>0.288</w:t>
+            </w:r>
+          </w:p>
+        </w:tc>
+        <w:tc>
+          <w:tcPr>
+            <w:tcW w:type="dxa" w:w="2016"/>
+          </w:tcPr>
+          <w:p>
+            <w:r/>
+            <w:r>
+              <w:rPr>
+                <w:b w:val="0"/>
+                <w:sz w:val="17"/>
+              </w:rPr>
+              <w:t>4 of 4</w:t>
+            </w:r>
+          </w:p>
+        </w:tc>
+        <w:tc>
+          <w:tcPr>
+            <w:tcW w:type="dxa" w:w="2016"/>
+          </w:tcPr>
+          <w:p>
+            <w:r/>
+            <w:r>
+              <w:rPr>
+                <w:b w:val="0"/>
+                <w:sz w:val="17"/>
+              </w:rPr>
+              <w:t>0.000</w:t>
+            </w:r>
+          </w:p>
+        </w:tc>
+        <w:tc>
+          <w:tcPr>
+            <w:tcW w:type="dxa" w:w="2016"/>
+          </w:tcPr>
+          <w:p>
+            <w:r/>
+            <w:r>
+              <w:rPr>
+                <w:b w:val="0"/>
+                <w:sz w:val="17"/>
+              </w:rPr>
+              <w:t>0.42</w:t>
+            </w:r>
+          </w:p>
+        </w:tc>
+      </w:tr>
+    </w:tbl>
+    <w:p>
+      <w:pPr>
+        <w:spacing w:after="80"/>
+        <w:jc w:val="both"/>
+      </w:pPr>
+      <w:r>
+        <w:rPr>
+          <w:b w:val="0"/>
+          <w:i w:val="0"/>
+          <w:sz w:val="8"/>
+        </w:rPr>
       </w:r>
     </w:p>
     <w:p>

</xml_diff>